<commit_message>
Evidencias Individuales fase 1 - Angelina Mendoza
</commit_message>
<xml_diff>
--- a/FASE 1/Evidencias Individuales/Angelina Mendoza/1.1_APT122_AutoevaluacionCompetenciasFase1.docx
+++ b/FASE 1/Evidencias Individuales/Angelina Mendoza/1.1_APT122_AutoevaluacionCompetenciasFase1.docx
@@ -191,25 +191,7 @@
           <w:sz w:val="24"/>
           <w:szCs w:val="24"/>
         </w:rPr>
-        <w:t xml:space="preserve">Piensa en tu proceso de aprendizaje durante el tiempo que has </w:t>
-      </w:r>
-      <w:proofErr w:type="gramStart"/>
-      <w:r>
-        <w:rPr>
-          <w:rFonts w:eastAsiaTheme="majorEastAsia"/>
-          <w:sz w:val="24"/>
-          <w:szCs w:val="24"/>
-        </w:rPr>
-        <w:t>estudiando</w:t>
-      </w:r>
-      <w:proofErr w:type="gramEnd"/>
-      <w:r>
-        <w:rPr>
-          <w:rFonts w:eastAsiaTheme="majorEastAsia"/>
-          <w:sz w:val="24"/>
-          <w:szCs w:val="24"/>
-        </w:rPr>
-        <w:t xml:space="preserve"> en Duoc UC y evalúa el nivel de logro que alcanzaste en cada competencia de tu plan de estudio. </w:t>
+        <w:t xml:space="preserve">Piensa en tu proceso de aprendizaje durante el tiempo que has estudiando en Duoc UC y evalúa el nivel de logro que alcanzaste en cada competencia de tu plan de estudio. </w:t>
       </w:r>
     </w:p>
     <w:p>
@@ -860,19 +842,8 @@
                 <w:sz w:val="24"/>
                 <w:szCs w:val="24"/>
               </w:rPr>
-              <w:t xml:space="preserve">Angelina Andrea Mendoza </w:t>
+              <w:t>Angelina Andrea Mendoza Yañez</w:t>
             </w:r>
-            <w:proofErr w:type="spellStart"/>
-            <w:r>
-              <w:rPr>
-                <w:rFonts w:eastAsiaTheme="majorEastAsia"/>
-                <w:color w:val="767171" w:themeColor="background2" w:themeShade="80"/>
-                <w:sz w:val="24"/>
-                <w:szCs w:val="24"/>
-              </w:rPr>
-              <w:t>Yañez</w:t>
-            </w:r>
-            <w:proofErr w:type="spellEnd"/>
           </w:p>
         </w:tc>
       </w:tr>
@@ -1320,11 +1291,19 @@
               <w:rPr>
                 <w:b/>
                 <w:bCs/>
-                <w:color w:val="FF0000"/>
                 <w:sz w:val="18"/>
                 <w:szCs w:val="18"/>
               </w:rPr>
             </w:pPr>
+            <w:r>
+              <w:rPr>
+                <w:b/>
+                <w:bCs/>
+                <w:sz w:val="18"/>
+                <w:szCs w:val="18"/>
+              </w:rPr>
+              <w:t>Diseñar y desarrollar soluciones de software de acuerdo con los requerimientos del usuario.</w:t>
+            </w:r>
           </w:p>
         </w:tc>
         <w:tc>
@@ -1357,6 +1336,15 @@
                 <w:szCs w:val="18"/>
               </w:rPr>
             </w:pPr>
+            <w:r>
+              <w:rPr>
+                <w:b/>
+                <w:bCs/>
+                <w:sz w:val="18"/>
+                <w:szCs w:val="18"/>
+              </w:rPr>
+              <w:t>X</w:t>
+            </w:r>
           </w:p>
         </w:tc>
         <w:tc>
@@ -1411,12 +1399,99 @@
           <w:tcPr>
             <w:tcW w:w="2557" w:type="dxa"/>
           </w:tcPr>
+          <w:tbl>
+            <w:tblPr>
+              <w:tblW w:w="0" w:type="auto"/>
+              <w:tblCellSpacing w:w="15" w:type="dxa"/>
+              <w:tblCellMar>
+                <w:top w:w="15" w:type="dxa"/>
+                <w:left w:w="15" w:type="dxa"/>
+                <w:bottom w:w="15" w:type="dxa"/>
+                <w:right w:w="15" w:type="dxa"/>
+              </w:tblCellMar>
+              <w:tblLook w:val="04A0" w:firstRow="1" w:lastRow="0" w:firstColumn="1" w:lastColumn="0" w:noHBand="0" w:noVBand="1"/>
+            </w:tblPr>
+            <w:tblGrid>
+              <w:gridCol w:w="96"/>
+            </w:tblGrid>
+            <w:tr>
+              <w:trPr>
+                <w:tblCellSpacing w:w="15" w:type="dxa"/>
+              </w:trPr>
+              <w:tc>
+                <w:tcPr>
+                  <w:tcW w:w="0" w:type="auto"/>
+                  <w:vAlign w:val="center"/>
+                  <w:hideMark/>
+                </w:tcPr>
+                <w:p>
+                  <w:pPr>
+                    <w:spacing w:after="0" w:line="240" w:lineRule="auto"/>
+                    <w:rPr>
+                      <w:sz w:val="18"/>
+                      <w:szCs w:val="18"/>
+                    </w:rPr>
+                  </w:pPr>
+                </w:p>
+              </w:tc>
+            </w:tr>
+          </w:tbl>
           <w:p>
             <w:pPr>
-              <w:jc w:val="center"/>
-              <w:rPr>
-                <w:b/>
-                <w:bCs/>
+              <w:rPr>
+                <w:vanish/>
+                <w:sz w:val="18"/>
+                <w:szCs w:val="18"/>
+              </w:rPr>
+            </w:pPr>
+          </w:p>
+          <w:tbl>
+            <w:tblPr>
+              <w:tblW w:w="0" w:type="auto"/>
+              <w:tblCellSpacing w:w="15" w:type="dxa"/>
+              <w:tblCellMar>
+                <w:top w:w="15" w:type="dxa"/>
+                <w:left w:w="15" w:type="dxa"/>
+                <w:bottom w:w="15" w:type="dxa"/>
+                <w:right w:w="15" w:type="dxa"/>
+              </w:tblCellMar>
+              <w:tblLook w:val="04A0" w:firstRow="1" w:lastRow="0" w:firstColumn="1" w:lastColumn="0" w:noHBand="0" w:noVBand="1"/>
+            </w:tblPr>
+            <w:tblGrid>
+              <w:gridCol w:w="2341"/>
+            </w:tblGrid>
+            <w:tr>
+              <w:trPr>
+                <w:tblCellSpacing w:w="15" w:type="dxa"/>
+              </w:trPr>
+              <w:tc>
+                <w:tcPr>
+                  <w:tcW w:w="0" w:type="auto"/>
+                  <w:vAlign w:val="center"/>
+                  <w:hideMark/>
+                </w:tcPr>
+                <w:p>
+                  <w:pPr>
+                    <w:spacing w:after="0" w:line="240" w:lineRule="auto"/>
+                    <w:rPr>
+                      <w:sz w:val="18"/>
+                      <w:szCs w:val="18"/>
+                    </w:rPr>
+                  </w:pPr>
+                  <w:r>
+                    <w:rPr>
+                      <w:sz w:val="18"/>
+                      <w:szCs w:val="18"/>
+                    </w:rPr>
+                    <w:t>Tengo un alto dominio en el desarrollo de soluciones de software, ya que durante la carrera he trabajado en proyectos que incluyen levantamiento de requerimientos, diseño, programación e implementación. Aún necesito reforzar la planificación y desarrollo de soluciones de mayor alcance.</w:t>
+                  </w:r>
+                </w:p>
+              </w:tc>
+            </w:tr>
+          </w:tbl>
+          <w:p>
+            <w:pPr>
+              <w:rPr>
                 <w:sz w:val="18"/>
                 <w:szCs w:val="18"/>
               </w:rPr>
@@ -1439,11 +1514,19 @@
               <w:rPr>
                 <w:b/>
                 <w:bCs/>
-                <w:color w:val="FF0000"/>
                 <w:sz w:val="18"/>
                 <w:szCs w:val="18"/>
               </w:rPr>
             </w:pPr>
+            <w:r>
+              <w:rPr>
+                <w:b/>
+                <w:bCs/>
+                <w:sz w:val="18"/>
+                <w:szCs w:val="18"/>
+              </w:rPr>
+              <w:t>Diseñar e implementar bases de datos para soportar soluciones informáticas.</w:t>
+            </w:r>
           </w:p>
         </w:tc>
         <w:tc>
@@ -1476,6 +1559,15 @@
                 <w:szCs w:val="18"/>
               </w:rPr>
             </w:pPr>
+            <w:r>
+              <w:rPr>
+                <w:b/>
+                <w:bCs/>
+                <w:sz w:val="18"/>
+                <w:szCs w:val="18"/>
+              </w:rPr>
+              <w:t>X</w:t>
+            </w:r>
           </w:p>
         </w:tc>
         <w:tc>
@@ -1532,14 +1624,18 @@
           </w:tcPr>
           <w:p>
             <w:pPr>
-              <w:jc w:val="center"/>
-              <w:rPr>
-                <w:b/>
-                <w:bCs/>
+              <w:rPr>
                 <w:sz w:val="18"/>
                 <w:szCs w:val="18"/>
               </w:rPr>
             </w:pPr>
+            <w:r>
+              <w:rPr>
+                <w:sz w:val="18"/>
+                <w:szCs w:val="18"/>
+              </w:rPr>
+              <w:t>Tengo un alto dominio en el diseño y uso de bases de datos relacionales, incluyendo creación de tablas, relaciones, consultas y operaciones sobre datos. Necesito reforzar aspectos relacionados con optimización, seguridad y manejo de bases de datos en sistemas de mayor escala.</w:t>
+            </w:r>
           </w:p>
         </w:tc>
       </w:tr>
@@ -1562,6 +1658,15 @@
                 <w:szCs w:val="18"/>
               </w:rPr>
             </w:pPr>
+            <w:r>
+              <w:rPr>
+                <w:b/>
+                <w:bCs/>
+                <w:sz w:val="18"/>
+                <w:szCs w:val="18"/>
+              </w:rPr>
+              <w:t>Aplicar técnicas de ingeniería de requisitos para identificar y especificar las necesidades de una solución informática.</w:t>
+            </w:r>
           </w:p>
         </w:tc>
         <w:tc>
@@ -1594,6 +1699,15 @@
                 <w:szCs w:val="18"/>
               </w:rPr>
             </w:pPr>
+            <w:r>
+              <w:rPr>
+                <w:b/>
+                <w:bCs/>
+                <w:sz w:val="18"/>
+                <w:szCs w:val="18"/>
+              </w:rPr>
+              <w:t>X</w:t>
+            </w:r>
           </w:p>
         </w:tc>
         <w:tc>
@@ -1650,14 +1764,18 @@
           </w:tcPr>
           <w:p>
             <w:pPr>
-              <w:jc w:val="center"/>
-              <w:rPr>
-                <w:b/>
-                <w:bCs/>
+              <w:rPr>
                 <w:sz w:val="18"/>
                 <w:szCs w:val="18"/>
               </w:rPr>
             </w:pPr>
+            <w:r>
+              <w:rPr>
+                <w:sz w:val="18"/>
+                <w:szCs w:val="18"/>
+              </w:rPr>
+              <w:t>Tengo un alto dominio para identificar actores, requerimientos funcionales y no funcionales y reglas de negocio. Quiero reforzar la validación y trazabilidad de los requerimientos durante todo el ciclo de desarrollo.</w:t>
+            </w:r>
           </w:p>
         </w:tc>
       </w:tr>
@@ -1680,6 +1798,15 @@
                 <w:szCs w:val="18"/>
               </w:rPr>
             </w:pPr>
+            <w:r>
+              <w:rPr>
+                <w:b/>
+                <w:bCs/>
+                <w:sz w:val="18"/>
+                <w:szCs w:val="18"/>
+              </w:rPr>
+              <w:t>Gestionar proyectos informáticos utilizando metodologías y herramientas de planificación y seguimiento.</w:t>
+            </w:r>
           </w:p>
         </w:tc>
         <w:tc>
@@ -1728,6 +1855,15 @@
                 <w:szCs w:val="18"/>
               </w:rPr>
             </w:pPr>
+            <w:r>
+              <w:rPr>
+                <w:b/>
+                <w:bCs/>
+                <w:sz w:val="18"/>
+                <w:szCs w:val="18"/>
+              </w:rPr>
+              <w:t>X</w:t>
+            </w:r>
           </w:p>
         </w:tc>
         <w:tc>
@@ -1768,14 +1904,26 @@
           </w:tcPr>
           <w:p>
             <w:pPr>
-              <w:jc w:val="center"/>
-              <w:rPr>
-                <w:b/>
-                <w:bCs/>
+              <w:rPr>
                 <w:sz w:val="18"/>
                 <w:szCs w:val="18"/>
               </w:rPr>
             </w:pPr>
+            <w:r>
+              <w:rPr>
+                <w:sz w:val="18"/>
+                <w:szCs w:val="18"/>
+              </w:rPr>
+              <w:t xml:space="preserve">Tengo un dominio aceptable en planificación, definición de tareas, prioridades y seguimiento de avances. Sin embargo, necesito fortalecer la aplicación práctica de metodologías ágiles y el control </w:t>
+            </w:r>
+            <w:r>
+              <w:rPr>
+                <w:sz w:val="18"/>
+                <w:szCs w:val="18"/>
+              </w:rPr>
+              <w:lastRenderedPageBreak/>
+              <w:t>formal de un proyecto completo.</w:t>
+            </w:r>
           </w:p>
         </w:tc>
       </w:tr>
@@ -1798,6 +1946,16 @@
                 <w:szCs w:val="18"/>
               </w:rPr>
             </w:pPr>
+            <w:r>
+              <w:rPr>
+                <w:b/>
+                <w:bCs/>
+                <w:sz w:val="18"/>
+                <w:szCs w:val="18"/>
+              </w:rPr>
+              <w:lastRenderedPageBreak/>
+              <w:t>Desarrollar soluciones considerando criterios de calidad y seguridad.</w:t>
+            </w:r>
           </w:p>
         </w:tc>
         <w:tc>
@@ -1846,6 +2004,15 @@
                 <w:szCs w:val="18"/>
               </w:rPr>
             </w:pPr>
+            <w:r>
+              <w:rPr>
+                <w:b/>
+                <w:bCs/>
+                <w:sz w:val="18"/>
+                <w:szCs w:val="18"/>
+              </w:rPr>
+              <w:t>X</w:t>
+            </w:r>
           </w:p>
         </w:tc>
         <w:tc>
@@ -1886,14 +2053,18 @@
           </w:tcPr>
           <w:p>
             <w:pPr>
-              <w:jc w:val="center"/>
-              <w:rPr>
-                <w:b/>
-                <w:bCs/>
+              <w:rPr>
                 <w:sz w:val="18"/>
                 <w:szCs w:val="18"/>
               </w:rPr>
             </w:pPr>
+            <w:r>
+              <w:rPr>
+                <w:sz w:val="18"/>
+                <w:szCs w:val="18"/>
+              </w:rPr>
+              <w:t>Tengo conocimientos para incorporar validaciones, control de acceso y buenas prácticas durante el desarrollo. Necesito profundizar en pruebas, seguridad de aplicaciones y definición de criterios de calidad desde las primeras etapas del proyecto.</w:t>
+            </w:r>
           </w:p>
         </w:tc>
       </w:tr>
@@ -1916,6 +2087,15 @@
                 <w:szCs w:val="18"/>
               </w:rPr>
             </w:pPr>
+            <w:r>
+              <w:rPr>
+                <w:b/>
+                <w:bCs/>
+                <w:sz w:val="18"/>
+                <w:szCs w:val="18"/>
+              </w:rPr>
+              <w:t>Desarrollar soluciones para dispositivos móviles.</w:t>
+            </w:r>
           </w:p>
         </w:tc>
         <w:tc>
@@ -1948,6 +2128,15 @@
                 <w:szCs w:val="18"/>
               </w:rPr>
             </w:pPr>
+            <w:r>
+              <w:rPr>
+                <w:b/>
+                <w:bCs/>
+                <w:sz w:val="18"/>
+                <w:szCs w:val="18"/>
+              </w:rPr>
+              <w:t>X</w:t>
+            </w:r>
           </w:p>
         </w:tc>
         <w:tc>
@@ -2004,14 +2193,18 @@
           </w:tcPr>
           <w:p>
             <w:pPr>
-              <w:jc w:val="center"/>
-              <w:rPr>
-                <w:b/>
-                <w:bCs/>
+              <w:rPr>
                 <w:sz w:val="18"/>
                 <w:szCs w:val="18"/>
               </w:rPr>
             </w:pPr>
+            <w:r>
+              <w:rPr>
+                <w:sz w:val="18"/>
+                <w:szCs w:val="18"/>
+              </w:rPr>
+              <w:t>Tengo un alto dominio en el desarrollo de aplicaciones móviles adquirido durante la carrera. Puedo implementar interfaces, navegación y funcionalidades móviles, aunque necesito reforzar la integración de servicios como geolocalización y notificaciones en aplicaciones de mayor complejidad.</w:t>
+            </w:r>
           </w:p>
         </w:tc>
       </w:tr>
@@ -8389,7 +8582,6 @@
   <w:style w:type="character" w:default="1" w:styleId="Fuentedeprrafopredeter">
     <w:name w:val="Default Paragraph Font"/>
     <w:uiPriority w:val="1"/>
-    <w:semiHidden/>
     <w:unhideWhenUsed/>
   </w:style>
   <w:style w:type="table" w:default="1" w:styleId="Tablanormal">
@@ -9690,10 +9882,6 @@
 </file>
 
 <file path=customXml/item1.xml><?xml version="1.0" encoding="utf-8"?>
-<b:Sources xmlns:b="http://schemas.openxmlformats.org/officeDocument/2006/bibliography" xmlns="http://schemas.openxmlformats.org/officeDocument/2006/bibliography" SelectedStyle="\APASixthEditionOfficeOnline.xsl" StyleName="APA" Version="6"/>
-</file>
-
-<file path=customXml/item2.xml><?xml version="1.0" encoding="utf-8"?>
 <ct:contentTypeSchema xmlns:ct="http://schemas.microsoft.com/office/2006/metadata/contentType" xmlns:ma="http://schemas.microsoft.com/office/2006/metadata/properties/metaAttributes" ct:_="" ma:_="" ma:contentTypeName="Documento" ma:contentTypeID="0x010100E96778489EE7714D8BD12CC105EB918B" ma:contentTypeVersion="2" ma:contentTypeDescription="Crear nuevo documento." ma:contentTypeScope="" ma:versionID="416c5c7ae9b5d54d83875cd3c65194e3">
   <xsd:schema xmlns:xsd="http://www.w3.org/2001/XMLSchema" xmlns:xs="http://www.w3.org/2001/XMLSchema" xmlns:p="http://schemas.microsoft.com/office/2006/metadata/properties" xmlns:ns2="126e8a1c-9ea9-435a-ac89-d06c80d62e30" targetNamespace="http://schemas.microsoft.com/office/2006/metadata/properties" ma:root="true" ma:fieldsID="70a237c842677bd850644f8595079f5e" ns2:_="">
     <xsd:import namespace="126e8a1c-9ea9-435a-ac89-d06c80d62e30"/>
@@ -9825,13 +10013,11 @@
 </ct:contentTypeSchema>
 </file>
 
-<file path=customXml/item3.xml><?xml version="1.0" encoding="utf-8"?>
-<p:properties xmlns:p="http://schemas.microsoft.com/office/2006/metadata/properties" xmlns:xsi="http://www.w3.org/2001/XMLSchema-instance" xmlns:pc="http://schemas.microsoft.com/office/infopath/2007/PartnerControls">
-  <documentManagement/>
-</p:properties>
+<file path=customXml/item2.xml><?xml version="1.0" encoding="utf-8"?>
+<b:Sources xmlns:b="http://schemas.openxmlformats.org/officeDocument/2006/bibliography" xmlns="http://schemas.openxmlformats.org/officeDocument/2006/bibliography" SelectedStyle="\APASixthEditionOfficeOnline.xsl" StyleName="APA" Version="6"/>
 </file>
 
-<file path=customXml/item4.xml><?xml version="1.0" encoding="utf-8"?>
+<file path=customXml/item3.xml><?xml version="1.0" encoding="utf-8"?>
 <?mso-contentType ?>
 <FormTemplates xmlns="http://schemas.microsoft.com/sharepoint/v3/contenttype/forms">
   <Display>DocumentLibraryForm</Display>
@@ -9840,15 +10026,13 @@
 </FormTemplates>
 </file>
 
-<file path=customXml/itemProps1.xml><?xml version="1.0" encoding="utf-8"?>
-<ds:datastoreItem xmlns:ds="http://schemas.openxmlformats.org/officeDocument/2006/customXml" ds:itemID="{6E8A10B9-B765-4F0B-A47F-7CB788CD8F65}">
-  <ds:schemaRefs>
-    <ds:schemaRef ds:uri="http://schemas.openxmlformats.org/officeDocument/2006/bibliography"/>
-  </ds:schemaRefs>
-</ds:datastoreItem>
+<file path=customXml/item4.xml><?xml version="1.0" encoding="utf-8"?>
+<p:properties xmlns:p="http://schemas.microsoft.com/office/2006/metadata/properties" xmlns:xsi="http://www.w3.org/2001/XMLSchema-instance" xmlns:pc="http://schemas.microsoft.com/office/infopath/2007/PartnerControls">
+  <documentManagement/>
+</p:properties>
 </file>
 
-<file path=customXml/itemProps2.xml><?xml version="1.0" encoding="utf-8"?>
+<file path=customXml/itemProps1.xml><?xml version="1.0" encoding="utf-8"?>
 <ds:datastoreItem xmlns:ds="http://schemas.openxmlformats.org/officeDocument/2006/customXml" ds:itemID="{767CD2D5-7A6C-47C3-9B54-C4225C74DD0B}">
   <ds:schemaRefs>
     <ds:schemaRef ds:uri="http://schemas.microsoft.com/office/2006/metadata/contentType"/>
@@ -9866,19 +10050,27 @@
 </ds:datastoreItem>
 </file>
 
+<file path=customXml/itemProps2.xml><?xml version="1.0" encoding="utf-8"?>
+<ds:datastoreItem xmlns:ds="http://schemas.openxmlformats.org/officeDocument/2006/customXml" ds:itemID="{6E8A10B9-B765-4F0B-A47F-7CB788CD8F65}">
+  <ds:schemaRefs>
+    <ds:schemaRef ds:uri="http://schemas.openxmlformats.org/officeDocument/2006/bibliography"/>
+  </ds:schemaRefs>
+</ds:datastoreItem>
+</file>
+
 <file path=customXml/itemProps3.xml><?xml version="1.0" encoding="utf-8"?>
+<ds:datastoreItem xmlns:ds="http://schemas.openxmlformats.org/officeDocument/2006/customXml" ds:itemID="{DABAA964-10BA-4DBC-ABF2-CDEAC0FAF7AA}">
+  <ds:schemaRefs>
+    <ds:schemaRef ds:uri="http://schemas.microsoft.com/sharepoint/v3/contenttype/forms"/>
+  </ds:schemaRefs>
+</ds:datastoreItem>
+</file>
+
+<file path=customXml/itemProps4.xml><?xml version="1.0" encoding="utf-8"?>
 <ds:datastoreItem xmlns:ds="http://schemas.openxmlformats.org/officeDocument/2006/customXml" ds:itemID="{5F1783E3-BA1C-4CA3-8E32-C9B378BBED03}">
   <ds:schemaRefs>
     <ds:schemaRef ds:uri="http://schemas.microsoft.com/office/2006/metadata/properties"/>
     <ds:schemaRef ds:uri="http://schemas.microsoft.com/office/infopath/2007/PartnerControls"/>
   </ds:schemaRefs>
 </ds:datastoreItem>
-</file>
-
-<file path=customXml/itemProps4.xml><?xml version="1.0" encoding="utf-8"?>
-<ds:datastoreItem xmlns:ds="http://schemas.openxmlformats.org/officeDocument/2006/customXml" ds:itemID="{DABAA964-10BA-4DBC-ABF2-CDEAC0FAF7AA}">
-  <ds:schemaRefs>
-    <ds:schemaRef ds:uri="http://schemas.microsoft.com/sharepoint/v3/contenttype/forms"/>
-  </ds:schemaRefs>
-</ds:datastoreItem>
 </file>
</xml_diff>